<commit_message>
se agrego codigo haskell al informe
</commit_message>
<xml_diff>
--- a/docs/Informe.docx
+++ b/docs/Informe.docx
@@ -2,6 +2,1026 @@
 <file path=word/document.xml><?xml version="1.0" encoding="utf-8"?>
 <w:document xmlns:wpc="http://schemas.microsoft.com/office/word/2010/wordprocessingCanvas" xmlns:cx="http://schemas.microsoft.com/office/drawing/2014/chartex" xmlns:cx1="http://schemas.microsoft.com/office/drawing/2015/9/8/chartex" xmlns:cx2="http://schemas.microsoft.com/office/drawing/2015/10/21/chartex" xmlns:cx3="http://schemas.microsoft.com/office/drawing/2016/5/9/chartex" xmlns:cx4="http://schemas.microsoft.com/office/drawing/2016/5/10/chartex" xmlns:cx5="http://schemas.microsoft.com/office/drawing/2016/5/11/chartex" xmlns:cx6="http://schemas.microsoft.com/office/drawing/2016/5/12/chartex" xmlns:cx7="http://schemas.microsoft.com/office/drawing/2016/5/13/chartex" xmlns:cx8="http://schemas.microsoft.com/office/drawing/2016/5/14/chartex" xmlns:mc="http://schemas.openxmlformats.org/markup-compatibility/2006" xmlns:aink="http://schemas.microsoft.com/office/drawing/2016/ink" xmlns:am3d="http://schemas.microsoft.com/office/drawing/2017/model3d" xmlns:o="urn:schemas-microsoft-com:office:office" xmlns:oel="http://schemas.microsoft.com/office/2019/extlst" xmlns:r="http://schemas.openxmlformats.org/officeDocument/2006/relationships" xmlns:m="http://schemas.openxmlformats.org/officeDocument/2006/math" xmlns:v="urn:schemas-microsoft-com:vml" xmlns:wp14="http://schemas.microsoft.com/office/word/2010/wordprocessingDrawing" xmlns:wp="http://schemas.openxmlformats.org/drawingml/2006/wordprocessingDrawing" xmlns:w10="urn:schemas-microsoft-com:office:word" xmlns:w="http://schemas.openxmlformats.org/wordprocessingml/2006/main" xmlns:w14="http://schemas.microsoft.com/office/word/2010/wordml" xmlns:w15="http://schemas.microsoft.com/office/word/2012/wordml" xmlns:w16cex="http://schemas.microsoft.com/office/word/2018/wordml/cex" xmlns:w16cid="http://schemas.microsoft.com/office/word/2016/wordml/cid" xmlns:w16="http://schemas.microsoft.com/office/word/2018/wordml" xmlns:w16sdtdh="http://schemas.microsoft.com/office/word/2020/wordml/sdtdatahash" xmlns:w16se="http://schemas.microsoft.com/office/word/2015/wordml/symex" xmlns:wpg="http://schemas.microsoft.com/office/word/2010/wordprocessingGroup" xmlns:wpi="http://schemas.microsoft.com/office/word/2010/wordprocessingInk" xmlns:wne="http://schemas.microsoft.com/office/word/2006/wordml" xmlns:wps="http://schemas.microsoft.com/office/word/2010/wordprocessingShape" mc:Ignorable="w14 w15 w16se w16cid w16 w16cex w16sdtdh wp14">
   <w:body>
+    <w:p>
+      <w:pPr>
+        <w:jc w:val="center"/>
+        <w:rPr>
+          <w:b/>
+          <w:bCs/>
+          <w:sz w:val="24"/>
+          <w:szCs w:val="24"/>
+          <w:lang w:val="es"/>
+        </w:rPr>
+      </w:pPr>
+      <w:r>
+        <w:rPr>
+          <w:b/>
+          <w:bCs/>
+          <w:sz w:val="24"/>
+          <w:szCs w:val="24"/>
+          <w:lang w:val="es"/>
+        </w:rPr>
+        <w:t>HASKELL</w:t>
+      </w:r>
+    </w:p>
+    <w:p>
+      <w:pPr>
+        <w:rPr>
+          <w:lang w:val="es"/>
+        </w:rPr>
+      </w:pPr>
+      <w:r>
+        <w:rPr>
+          <w:lang w:val="es"/>
+        </w:rPr>
+        <w:t xml:space="preserve">En Haskell, la función principal siempre se llama </w:t>
+      </w:r>
+      <w:proofErr w:type="spellStart"/>
+      <w:r>
+        <w:rPr>
+          <w:lang w:val="es"/>
+        </w:rPr>
+        <w:t>main</w:t>
+      </w:r>
+      <w:proofErr w:type="spellEnd"/>
+      <w:r>
+        <w:rPr>
+          <w:lang w:val="es"/>
+        </w:rPr>
+        <w:t>.</w:t>
+      </w:r>
+    </w:p>
+    <w:p>
+      <w:pPr>
+        <w:rPr>
+          <w:lang w:val="es"/>
+        </w:rPr>
+      </w:pPr>
+      <w:r>
+        <w:rPr>
+          <w:noProof/>
+          <w:lang w:val="es"/>
+        </w:rPr>
+        <w:drawing>
+          <wp:inline distT="0" distB="0" distL="0" distR="0" wp14:anchorId="495FBE50" wp14:editId="0998E667">
+            <wp:extent cx="3581400" cy="781050"/>
+            <wp:effectExtent l="0" t="0" r="0" b="0"/>
+            <wp:docPr id="2" name="Imagen 2"/>
+            <wp:cNvGraphicFramePr>
+              <a:graphicFrameLocks xmlns:a="http://schemas.openxmlformats.org/drawingml/2006/main" noChangeAspect="1"/>
+            </wp:cNvGraphicFramePr>
+            <a:graphic xmlns:a="http://schemas.openxmlformats.org/drawingml/2006/main">
+              <a:graphicData uri="http://schemas.openxmlformats.org/drawingml/2006/picture">
+                <pic:pic xmlns:pic="http://schemas.openxmlformats.org/drawingml/2006/picture">
+                  <pic:nvPicPr>
+                    <pic:cNvPr id="0" name="Picture 1"/>
+                    <pic:cNvPicPr>
+                      <a:picLocks noChangeAspect="1" noChangeArrowheads="1"/>
+                    </pic:cNvPicPr>
+                  </pic:nvPicPr>
+                  <pic:blipFill>
+                    <a:blip r:embed="rId4">
+                      <a:extLst>
+                        <a:ext uri="{28A0092B-C50C-407E-A947-70E740481C1C}">
+                          <a14:useLocalDpi xmlns:a14="http://schemas.microsoft.com/office/drawing/2010/main" val="0"/>
+                        </a:ext>
+                      </a:extLst>
+                    </a:blip>
+                    <a:srcRect/>
+                    <a:stretch>
+                      <a:fillRect/>
+                    </a:stretch>
+                  </pic:blipFill>
+                  <pic:spPr bwMode="auto">
+                    <a:xfrm>
+                      <a:off x="0" y="0"/>
+                      <a:ext cx="3581400" cy="781050"/>
+                    </a:xfrm>
+                    <a:prstGeom prst="rect">
+                      <a:avLst/>
+                    </a:prstGeom>
+                    <a:noFill/>
+                    <a:ln>
+                      <a:noFill/>
+                    </a:ln>
+                  </pic:spPr>
+                </pic:pic>
+              </a:graphicData>
+            </a:graphic>
+          </wp:inline>
+        </w:drawing>
+      </w:r>
+    </w:p>
+    <w:p>
+      <w:pPr>
+        <w:rPr>
+          <w:u w:val="single"/>
+          <w:lang w:val="es"/>
+        </w:rPr>
+      </w:pPr>
+      <w:r>
+        <w:rPr>
+          <w:u w:val="single"/>
+          <w:lang w:val="es"/>
+        </w:rPr>
+        <w:t xml:space="preserve">Funciones </w:t>
+      </w:r>
+      <w:r>
+        <w:rPr>
+          <w:u w:val="single"/>
+          <w:lang w:val="es"/>
+        </w:rPr>
+        <w:t>Básicas</w:t>
+      </w:r>
+      <w:r>
+        <w:rPr>
+          <w:u w:val="single"/>
+          <w:lang w:val="es"/>
+        </w:rPr>
+        <w:t xml:space="preserve"> y Tipos</w:t>
+      </w:r>
+    </w:p>
+    <w:p>
+      <w:pPr>
+        <w:rPr>
+          <w:lang w:val="es"/>
+        </w:rPr>
+      </w:pPr>
+      <w:r>
+        <w:rPr>
+          <w:lang w:val="es"/>
+        </w:rPr>
+        <w:t xml:space="preserve">Una función que suma dos números </w:t>
+      </w:r>
+    </w:p>
+    <w:p>
+      <w:pPr>
+        <w:rPr>
+          <w:lang w:val="es"/>
+        </w:rPr>
+      </w:pPr>
+      <w:r>
+        <w:rPr>
+          <w:lang w:val="es"/>
+        </w:rPr>
+        <w:t>Una función con un condicional (</w:t>
+      </w:r>
+      <w:proofErr w:type="spellStart"/>
+      <w:r>
+        <w:rPr>
+          <w:lang w:val="es"/>
+        </w:rPr>
+        <w:t>if-then-else</w:t>
+      </w:r>
+      <w:proofErr w:type="spellEnd"/>
+      <w:r>
+        <w:rPr>
+          <w:lang w:val="es"/>
+        </w:rPr>
+        <w:t>)</w:t>
+      </w:r>
+    </w:p>
+    <w:p>
+      <w:pPr>
+        <w:rPr>
+          <w:lang w:val="es"/>
+        </w:rPr>
+      </w:pPr>
+      <w:r>
+        <w:rPr>
+          <w:noProof/>
+        </w:rPr>
+        <w:drawing>
+          <wp:inline distT="0" distB="0" distL="0" distR="0" wp14:anchorId="464D2131" wp14:editId="4EAC5F67">
+            <wp:extent cx="4057650" cy="2876550"/>
+            <wp:effectExtent l="0" t="0" r="0" b="0"/>
+            <wp:docPr id="5" name="Imagen 5"/>
+            <wp:cNvGraphicFramePr>
+              <a:graphicFrameLocks xmlns:a="http://schemas.openxmlformats.org/drawingml/2006/main" noChangeAspect="1"/>
+            </wp:cNvGraphicFramePr>
+            <a:graphic xmlns:a="http://schemas.openxmlformats.org/drawingml/2006/main">
+              <a:graphicData uri="http://schemas.openxmlformats.org/drawingml/2006/picture">
+                <pic:pic xmlns:pic="http://schemas.openxmlformats.org/drawingml/2006/picture">
+                  <pic:nvPicPr>
+                    <pic:cNvPr id="0" name="Picture 2"/>
+                    <pic:cNvPicPr>
+                      <a:picLocks noChangeAspect="1" noChangeArrowheads="1"/>
+                    </pic:cNvPicPr>
+                  </pic:nvPicPr>
+                  <pic:blipFill>
+                    <a:blip r:embed="rId5">
+                      <a:extLst>
+                        <a:ext uri="{28A0092B-C50C-407E-A947-70E740481C1C}">
+                          <a14:useLocalDpi xmlns:a14="http://schemas.microsoft.com/office/drawing/2010/main" val="0"/>
+                        </a:ext>
+                      </a:extLst>
+                    </a:blip>
+                    <a:srcRect/>
+                    <a:stretch>
+                      <a:fillRect/>
+                    </a:stretch>
+                  </pic:blipFill>
+                  <pic:spPr bwMode="auto">
+                    <a:xfrm>
+                      <a:off x="0" y="0"/>
+                      <a:ext cx="4057650" cy="2876550"/>
+                    </a:xfrm>
+                    <a:prstGeom prst="rect">
+                      <a:avLst/>
+                    </a:prstGeom>
+                    <a:noFill/>
+                    <a:ln>
+                      <a:noFill/>
+                    </a:ln>
+                  </pic:spPr>
+                </pic:pic>
+              </a:graphicData>
+            </a:graphic>
+          </wp:inline>
+        </w:drawing>
+      </w:r>
+    </w:p>
+    <w:p>
+      <w:pPr>
+        <w:rPr>
+          <w:u w:val="single"/>
+          <w:lang w:val="es"/>
+        </w:rPr>
+      </w:pPr>
+    </w:p>
+    <w:p>
+      <w:pPr>
+        <w:rPr>
+          <w:u w:val="single"/>
+          <w:lang w:val="es"/>
+        </w:rPr>
+      </w:pPr>
+    </w:p>
+    <w:p>
+      <w:pPr>
+        <w:rPr>
+          <w:u w:val="single"/>
+          <w:lang w:val="es"/>
+        </w:rPr>
+      </w:pPr>
+    </w:p>
+    <w:p>
+      <w:pPr>
+        <w:rPr>
+          <w:u w:val="single"/>
+          <w:lang w:val="es"/>
+        </w:rPr>
+      </w:pPr>
+    </w:p>
+    <w:p>
+      <w:pPr>
+        <w:rPr>
+          <w:u w:val="single"/>
+          <w:lang w:val="es"/>
+        </w:rPr>
+      </w:pPr>
+    </w:p>
+    <w:p>
+      <w:pPr>
+        <w:rPr>
+          <w:u w:val="single"/>
+          <w:lang w:val="es"/>
+        </w:rPr>
+      </w:pPr>
+    </w:p>
+    <w:p>
+      <w:pPr>
+        <w:rPr>
+          <w:u w:val="single"/>
+          <w:lang w:val="es"/>
+        </w:rPr>
+      </w:pPr>
+    </w:p>
+    <w:p>
+      <w:pPr>
+        <w:rPr>
+          <w:u w:val="single"/>
+          <w:lang w:val="es"/>
+        </w:rPr>
+      </w:pPr>
+    </w:p>
+    <w:p>
+      <w:pPr>
+        <w:rPr>
+          <w:u w:val="single"/>
+          <w:lang w:val="es"/>
+        </w:rPr>
+      </w:pPr>
+    </w:p>
+    <w:p>
+      <w:pPr>
+        <w:rPr>
+          <w:u w:val="single"/>
+          <w:lang w:val="es"/>
+        </w:rPr>
+      </w:pPr>
+    </w:p>
+    <w:p>
+      <w:pPr>
+        <w:rPr>
+          <w:u w:val="single"/>
+          <w:lang w:val="es"/>
+        </w:rPr>
+      </w:pPr>
+      <w:r>
+        <w:rPr>
+          <w:u w:val="single"/>
+          <w:lang w:val="es"/>
+        </w:rPr>
+        <w:lastRenderedPageBreak/>
+        <w:t xml:space="preserve">Listas </w:t>
+      </w:r>
+    </w:p>
+    <w:p>
+      <w:pPr>
+        <w:rPr>
+          <w:lang w:val="es"/>
+        </w:rPr>
+      </w:pPr>
+      <w:r>
+        <w:rPr>
+          <w:lang w:val="es"/>
+        </w:rPr>
+        <w:t>Las listas en Haskell son homogéneas (todos los elementos deben ser del mismo tipo)</w:t>
+      </w:r>
+      <w:r>
+        <w:rPr>
+          <w:lang w:val="es"/>
+        </w:rPr>
+        <w:t>.</w:t>
+      </w:r>
+    </w:p>
+    <w:p>
+      <w:pPr>
+        <w:rPr>
+          <w:lang w:val="es"/>
+        </w:rPr>
+      </w:pPr>
+      <w:r>
+        <w:rPr>
+          <w:lang w:val="es"/>
+        </w:rPr>
+        <w:t>Como definir listas</w:t>
+      </w:r>
+      <w:r>
+        <w:rPr>
+          <w:lang w:val="es"/>
+        </w:rPr>
+        <w:t>.</w:t>
+      </w:r>
+    </w:p>
+    <w:p>
+      <w:pPr>
+        <w:rPr>
+          <w:lang w:val="es"/>
+        </w:rPr>
+      </w:pPr>
+      <w:r>
+        <w:rPr>
+          <w:lang w:val="es"/>
+        </w:rPr>
+        <w:t>Operaciones comunes</w:t>
+      </w:r>
+      <w:r>
+        <w:rPr>
+          <w:lang w:val="es"/>
+        </w:rPr>
+        <w:t>.</w:t>
+      </w:r>
+    </w:p>
+    <w:p>
+      <w:pPr>
+        <w:rPr>
+          <w:lang w:val="es"/>
+        </w:rPr>
+      </w:pPr>
+      <w:r>
+        <w:rPr>
+          <w:noProof/>
+          <w:lang w:val="es"/>
+        </w:rPr>
+        <w:drawing>
+          <wp:inline distT="0" distB="0" distL="0" distR="0" wp14:anchorId="034DAAB4" wp14:editId="571E640A">
+            <wp:extent cx="4924425" cy="2299180"/>
+            <wp:effectExtent l="0" t="0" r="0" b="6350"/>
+            <wp:docPr id="6" name="Imagen 6"/>
+            <wp:cNvGraphicFramePr>
+              <a:graphicFrameLocks xmlns:a="http://schemas.openxmlformats.org/drawingml/2006/main" noChangeAspect="1"/>
+            </wp:cNvGraphicFramePr>
+            <a:graphic xmlns:a="http://schemas.openxmlformats.org/drawingml/2006/main">
+              <a:graphicData uri="http://schemas.openxmlformats.org/drawingml/2006/picture">
+                <pic:pic xmlns:pic="http://schemas.openxmlformats.org/drawingml/2006/picture">
+                  <pic:nvPicPr>
+                    <pic:cNvPr id="0" name="Picture 4"/>
+                    <pic:cNvPicPr>
+                      <a:picLocks noChangeAspect="1" noChangeArrowheads="1"/>
+                    </pic:cNvPicPr>
+                  </pic:nvPicPr>
+                  <pic:blipFill>
+                    <a:blip r:embed="rId6">
+                      <a:extLst>
+                        <a:ext uri="{28A0092B-C50C-407E-A947-70E740481C1C}">
+                          <a14:useLocalDpi xmlns:a14="http://schemas.microsoft.com/office/drawing/2010/main" val="0"/>
+                        </a:ext>
+                      </a:extLst>
+                    </a:blip>
+                    <a:srcRect/>
+                    <a:stretch>
+                      <a:fillRect/>
+                    </a:stretch>
+                  </pic:blipFill>
+                  <pic:spPr bwMode="auto">
+                    <a:xfrm>
+                      <a:off x="0" y="0"/>
+                      <a:ext cx="4938913" cy="2305944"/>
+                    </a:xfrm>
+                    <a:prstGeom prst="rect">
+                      <a:avLst/>
+                    </a:prstGeom>
+                    <a:noFill/>
+                    <a:ln>
+                      <a:noFill/>
+                    </a:ln>
+                  </pic:spPr>
+                </pic:pic>
+              </a:graphicData>
+            </a:graphic>
+          </wp:inline>
+        </w:drawing>
+      </w:r>
+    </w:p>
+    <w:p>
+      <w:pPr>
+        <w:rPr>
+          <w:highlight w:val="yellow"/>
+          <w:lang w:val="es"/>
+        </w:rPr>
+      </w:pPr>
+    </w:p>
+    <w:p>
+      <w:pPr>
+        <w:rPr>
+          <w:u w:val="single"/>
+          <w:lang w:val="es"/>
+        </w:rPr>
+      </w:pPr>
+      <w:r>
+        <w:rPr>
+          <w:u w:val="single"/>
+          <w:lang w:val="es"/>
+        </w:rPr>
+        <w:t>Tuplas</w:t>
+      </w:r>
+    </w:p>
+    <w:p>
+      <w:pPr>
+        <w:rPr>
+          <w:lang w:val="es"/>
+        </w:rPr>
+      </w:pPr>
+      <w:r>
+        <w:rPr>
+          <w:lang w:val="es"/>
+        </w:rPr>
+        <w:t>L</w:t>
+      </w:r>
+      <w:r>
+        <w:rPr>
+          <w:lang w:val="es"/>
+        </w:rPr>
+        <w:t>as tuplas pueden mezclar tipos</w:t>
+      </w:r>
+      <w:r>
+        <w:rPr>
+          <w:lang w:val="es"/>
+        </w:rPr>
+        <w:t xml:space="preserve"> </w:t>
+      </w:r>
+      <w:r>
+        <w:rPr>
+          <w:lang w:val="es"/>
+        </w:rPr>
+        <w:t>(pueden ser de distintos tipos), pero tienen un tamaño fijo</w:t>
+      </w:r>
+    </w:p>
+    <w:p>
+      <w:pPr>
+        <w:rPr>
+          <w:lang w:val="es"/>
+        </w:rPr>
+      </w:pPr>
+      <w:r>
+        <w:rPr>
+          <w:lang w:val="es"/>
+        </w:rPr>
+        <w:t>Una tupla que representa un usuario (nombre, edad)</w:t>
+      </w:r>
+    </w:p>
+    <w:p>
+      <w:pPr>
+        <w:rPr>
+          <w:highlight w:val="yellow"/>
+          <w:lang w:val="es"/>
+        </w:rPr>
+      </w:pPr>
+      <w:r>
+        <w:rPr>
+          <w:noProof/>
+          <w:lang w:val="es"/>
+        </w:rPr>
+        <w:drawing>
+          <wp:inline distT="0" distB="0" distL="0" distR="0" wp14:anchorId="05FCE96F" wp14:editId="549BD021">
+            <wp:extent cx="3819525" cy="1562100"/>
+            <wp:effectExtent l="0" t="0" r="9525" b="0"/>
+            <wp:docPr id="7" name="Imagen 7"/>
+            <wp:cNvGraphicFramePr>
+              <a:graphicFrameLocks xmlns:a="http://schemas.openxmlformats.org/drawingml/2006/main" noChangeAspect="1"/>
+            </wp:cNvGraphicFramePr>
+            <a:graphic xmlns:a="http://schemas.openxmlformats.org/drawingml/2006/main">
+              <a:graphicData uri="http://schemas.openxmlformats.org/drawingml/2006/picture">
+                <pic:pic xmlns:pic="http://schemas.openxmlformats.org/drawingml/2006/picture">
+                  <pic:nvPicPr>
+                    <pic:cNvPr id="0" name="Picture 5"/>
+                    <pic:cNvPicPr>
+                      <a:picLocks noChangeAspect="1" noChangeArrowheads="1"/>
+                    </pic:cNvPicPr>
+                  </pic:nvPicPr>
+                  <pic:blipFill>
+                    <a:blip r:embed="rId7">
+                      <a:extLst>
+                        <a:ext uri="{28A0092B-C50C-407E-A947-70E740481C1C}">
+                          <a14:useLocalDpi xmlns:a14="http://schemas.microsoft.com/office/drawing/2010/main" val="0"/>
+                        </a:ext>
+                      </a:extLst>
+                    </a:blip>
+                    <a:srcRect/>
+                    <a:stretch>
+                      <a:fillRect/>
+                    </a:stretch>
+                  </pic:blipFill>
+                  <pic:spPr bwMode="auto">
+                    <a:xfrm>
+                      <a:off x="0" y="0"/>
+                      <a:ext cx="3819525" cy="1562100"/>
+                    </a:xfrm>
+                    <a:prstGeom prst="rect">
+                      <a:avLst/>
+                    </a:prstGeom>
+                    <a:noFill/>
+                    <a:ln>
+                      <a:noFill/>
+                    </a:ln>
+                  </pic:spPr>
+                </pic:pic>
+              </a:graphicData>
+            </a:graphic>
+          </wp:inline>
+        </w:drawing>
+      </w:r>
+    </w:p>
+    <w:p>
+      <w:pPr>
+        <w:rPr>
+          <w:highlight w:val="yellow"/>
+          <w:lang w:val="es"/>
+        </w:rPr>
+      </w:pPr>
+    </w:p>
+    <w:p>
+      <w:pPr>
+        <w:rPr>
+          <w:highlight w:val="yellow"/>
+          <w:lang w:val="es"/>
+        </w:rPr>
+      </w:pPr>
+    </w:p>
+    <w:p>
+      <w:pPr>
+        <w:rPr>
+          <w:highlight w:val="yellow"/>
+          <w:lang w:val="es"/>
+        </w:rPr>
+      </w:pPr>
+    </w:p>
+    <w:p>
+      <w:pPr>
+        <w:rPr>
+          <w:highlight w:val="yellow"/>
+          <w:lang w:val="es"/>
+        </w:rPr>
+      </w:pPr>
+    </w:p>
+    <w:p>
+      <w:pPr>
+        <w:rPr>
+          <w:highlight w:val="yellow"/>
+          <w:lang w:val="es"/>
+        </w:rPr>
+      </w:pPr>
+    </w:p>
+    <w:p>
+      <w:pPr>
+        <w:rPr>
+          <w:highlight w:val="yellow"/>
+          <w:lang w:val="es"/>
+        </w:rPr>
+      </w:pPr>
+    </w:p>
+    <w:p>
+      <w:pPr>
+        <w:rPr>
+          <w:u w:val="single"/>
+          <w:lang w:val="es"/>
+        </w:rPr>
+      </w:pPr>
+      <w:r>
+        <w:rPr>
+          <w:u w:val="single"/>
+          <w:lang w:val="es"/>
+        </w:rPr>
+        <w:lastRenderedPageBreak/>
+        <w:t>Pattern Matching</w:t>
+      </w:r>
+    </w:p>
+    <w:p>
+      <w:pPr>
+        <w:rPr>
+          <w:highlight w:val="yellow"/>
+          <w:lang w:val="es"/>
+        </w:rPr>
+      </w:pPr>
+      <w:r>
+        <w:rPr>
+          <w:lang w:val="es"/>
+        </w:rPr>
+        <w:t>En lugar de usar muchos</w:t>
+      </w:r>
+      <w:r>
+        <w:rPr>
+          <w:lang w:val="es"/>
+        </w:rPr>
+        <w:t xml:space="preserve"> IF</w:t>
+      </w:r>
+      <w:r>
+        <w:rPr>
+          <w:lang w:val="es"/>
+        </w:rPr>
+        <w:t xml:space="preserve"> buscas que coincidan los argumentos directamente.</w:t>
+      </w:r>
+    </w:p>
+    <w:p>
+      <w:pPr>
+        <w:rPr>
+          <w:highlight w:val="yellow"/>
+          <w:lang w:val="es"/>
+        </w:rPr>
+      </w:pPr>
+      <w:r>
+        <w:rPr>
+          <w:noProof/>
+          <w:highlight w:val="yellow"/>
+          <w:lang w:val="es"/>
+        </w:rPr>
+        <w:drawing>
+          <wp:inline distT="0" distB="0" distL="0" distR="0" wp14:anchorId="0FE18224" wp14:editId="081E5E0E">
+            <wp:extent cx="5610225" cy="2962275"/>
+            <wp:effectExtent l="0" t="0" r="9525" b="9525"/>
+            <wp:docPr id="8" name="Imagen 8"/>
+            <wp:cNvGraphicFramePr>
+              <a:graphicFrameLocks xmlns:a="http://schemas.openxmlformats.org/drawingml/2006/main" noChangeAspect="1"/>
+            </wp:cNvGraphicFramePr>
+            <a:graphic xmlns:a="http://schemas.openxmlformats.org/drawingml/2006/main">
+              <a:graphicData uri="http://schemas.openxmlformats.org/drawingml/2006/picture">
+                <pic:pic xmlns:pic="http://schemas.openxmlformats.org/drawingml/2006/picture">
+                  <pic:nvPicPr>
+                    <pic:cNvPr id="0" name="Picture 6"/>
+                    <pic:cNvPicPr>
+                      <a:picLocks noChangeAspect="1" noChangeArrowheads="1"/>
+                    </pic:cNvPicPr>
+                  </pic:nvPicPr>
+                  <pic:blipFill>
+                    <a:blip r:embed="rId8">
+                      <a:extLst>
+                        <a:ext uri="{28A0092B-C50C-407E-A947-70E740481C1C}">
+                          <a14:useLocalDpi xmlns:a14="http://schemas.microsoft.com/office/drawing/2010/main" val="0"/>
+                        </a:ext>
+                      </a:extLst>
+                    </a:blip>
+                    <a:srcRect/>
+                    <a:stretch>
+                      <a:fillRect/>
+                    </a:stretch>
+                  </pic:blipFill>
+                  <pic:spPr bwMode="auto">
+                    <a:xfrm>
+                      <a:off x="0" y="0"/>
+                      <a:ext cx="5610225" cy="2962275"/>
+                    </a:xfrm>
+                    <a:prstGeom prst="rect">
+                      <a:avLst/>
+                    </a:prstGeom>
+                    <a:noFill/>
+                    <a:ln>
+                      <a:noFill/>
+                    </a:ln>
+                  </pic:spPr>
+                </pic:pic>
+              </a:graphicData>
+            </a:graphic>
+          </wp:inline>
+        </w:drawing>
+      </w:r>
+    </w:p>
+    <w:p>
+      <w:pPr>
+        <w:rPr>
+          <w:highlight w:val="yellow"/>
+          <w:lang w:val="es"/>
+        </w:rPr>
+      </w:pPr>
+    </w:p>
+    <w:p>
+      <w:pPr>
+        <w:rPr>
+          <w:u w:val="single"/>
+          <w:lang w:val="es"/>
+        </w:rPr>
+      </w:pPr>
+      <w:r>
+        <w:rPr>
+          <w:u w:val="single"/>
+          <w:lang w:val="es"/>
+        </w:rPr>
+        <w:t xml:space="preserve">Funciones </w:t>
+      </w:r>
+      <w:proofErr w:type="spellStart"/>
+      <w:r>
+        <w:rPr>
+          <w:u w:val="single"/>
+          <w:lang w:val="es"/>
+        </w:rPr>
+        <w:t>Map</w:t>
+      </w:r>
+      <w:proofErr w:type="spellEnd"/>
+      <w:r>
+        <w:rPr>
+          <w:u w:val="single"/>
+          <w:lang w:val="es"/>
+        </w:rPr>
+        <w:t xml:space="preserve"> y </w:t>
+      </w:r>
+      <w:proofErr w:type="spellStart"/>
+      <w:r>
+        <w:rPr>
+          <w:u w:val="single"/>
+          <w:lang w:val="es"/>
+        </w:rPr>
+        <w:t>Filter</w:t>
+      </w:r>
+      <w:proofErr w:type="spellEnd"/>
+    </w:p>
+    <w:p>
+      <w:pPr>
+        <w:rPr>
+          <w:lang w:val="es"/>
+        </w:rPr>
+      </w:pPr>
+      <w:proofErr w:type="spellStart"/>
+      <w:r>
+        <w:rPr>
+          <w:lang w:val="es"/>
+        </w:rPr>
+        <w:t>map</w:t>
+      </w:r>
+      <w:proofErr w:type="spellEnd"/>
+      <w:r>
+        <w:rPr>
+          <w:lang w:val="es"/>
+        </w:rPr>
+        <w:t>: Aplica una función a cada elemento</w:t>
+      </w:r>
+    </w:p>
+    <w:p>
+      <w:pPr>
+        <w:rPr>
+          <w:lang w:val="es"/>
+        </w:rPr>
+      </w:pPr>
+      <w:proofErr w:type="spellStart"/>
+      <w:r>
+        <w:rPr>
+          <w:lang w:val="es"/>
+        </w:rPr>
+        <w:t>filter</w:t>
+      </w:r>
+      <w:proofErr w:type="spellEnd"/>
+      <w:r>
+        <w:rPr>
+          <w:lang w:val="es"/>
+        </w:rPr>
+        <w:t>: Filtra los elementos que cumplen una condición</w:t>
+      </w:r>
+    </w:p>
+    <w:p>
+      <w:pPr>
+        <w:rPr>
+          <w:highlight w:val="yellow"/>
+          <w:lang w:val="es"/>
+        </w:rPr>
+      </w:pPr>
+      <w:r>
+        <w:rPr>
+          <w:noProof/>
+          <w:lang w:val="es"/>
+        </w:rPr>
+        <w:drawing>
+          <wp:inline distT="0" distB="0" distL="0" distR="0" wp14:anchorId="40B0A241" wp14:editId="5C9AAA6E">
+            <wp:extent cx="5610225" cy="3343275"/>
+            <wp:effectExtent l="0" t="0" r="9525" b="9525"/>
+            <wp:docPr id="9" name="Imagen 9"/>
+            <wp:cNvGraphicFramePr>
+              <a:graphicFrameLocks xmlns:a="http://schemas.openxmlformats.org/drawingml/2006/main" noChangeAspect="1"/>
+            </wp:cNvGraphicFramePr>
+            <a:graphic xmlns:a="http://schemas.openxmlformats.org/drawingml/2006/main">
+              <a:graphicData uri="http://schemas.openxmlformats.org/drawingml/2006/picture">
+                <pic:pic xmlns:pic="http://schemas.openxmlformats.org/drawingml/2006/picture">
+                  <pic:nvPicPr>
+                    <pic:cNvPr id="0" name="Picture 7"/>
+                    <pic:cNvPicPr>
+                      <a:picLocks noChangeAspect="1" noChangeArrowheads="1"/>
+                    </pic:cNvPicPr>
+                  </pic:nvPicPr>
+                  <pic:blipFill>
+                    <a:blip r:embed="rId9">
+                      <a:extLst>
+                        <a:ext uri="{28A0092B-C50C-407E-A947-70E740481C1C}">
+                          <a14:useLocalDpi xmlns:a14="http://schemas.microsoft.com/office/drawing/2010/main" val="0"/>
+                        </a:ext>
+                      </a:extLst>
+                    </a:blip>
+                    <a:srcRect/>
+                    <a:stretch>
+                      <a:fillRect/>
+                    </a:stretch>
+                  </pic:blipFill>
+                  <pic:spPr bwMode="auto">
+                    <a:xfrm>
+                      <a:off x="0" y="0"/>
+                      <a:ext cx="5610225" cy="3343275"/>
+                    </a:xfrm>
+                    <a:prstGeom prst="rect">
+                      <a:avLst/>
+                    </a:prstGeom>
+                    <a:noFill/>
+                    <a:ln>
+                      <a:noFill/>
+                    </a:ln>
+                  </pic:spPr>
+                </pic:pic>
+              </a:graphicData>
+            </a:graphic>
+          </wp:inline>
+        </w:drawing>
+      </w:r>
+    </w:p>
+    <w:p>
+      <w:pPr>
+        <w:rPr>
+          <w:u w:val="single"/>
+          <w:lang w:val="es"/>
+        </w:rPr>
+      </w:pPr>
+      <w:r>
+        <w:rPr>
+          <w:u w:val="single"/>
+          <w:lang w:val="es"/>
+        </w:rPr>
+        <w:lastRenderedPageBreak/>
+        <w:t>Guardas</w:t>
+      </w:r>
+    </w:p>
+    <w:p>
+      <w:pPr>
+        <w:rPr>
+          <w:highlight w:val="yellow"/>
+          <w:lang w:val="es"/>
+        </w:rPr>
+      </w:pPr>
+      <w:r>
+        <w:rPr>
+          <w:lang w:val="es"/>
+        </w:rPr>
+        <w:t>Parecidas a un switch pero evaluando condiciones verdaderas/falsas</w:t>
+      </w:r>
+    </w:p>
+    <w:p>
+      <w:pPr>
+        <w:rPr>
+          <w:highlight w:val="yellow"/>
+          <w:lang w:val="es"/>
+        </w:rPr>
+      </w:pPr>
+      <w:r>
+        <w:rPr>
+          <w:noProof/>
+        </w:rPr>
+        <w:drawing>
+          <wp:inline distT="0" distB="0" distL="0" distR="0" wp14:anchorId="7D32E862" wp14:editId="485CF43B">
+            <wp:extent cx="5181600" cy="2562225"/>
+            <wp:effectExtent l="0" t="0" r="0" b="9525"/>
+            <wp:docPr id="11" name="Imagen 11"/>
+            <wp:cNvGraphicFramePr>
+              <a:graphicFrameLocks xmlns:a="http://schemas.openxmlformats.org/drawingml/2006/main" noChangeAspect="1"/>
+            </wp:cNvGraphicFramePr>
+            <a:graphic xmlns:a="http://schemas.openxmlformats.org/drawingml/2006/main">
+              <a:graphicData uri="http://schemas.openxmlformats.org/drawingml/2006/picture">
+                <pic:pic xmlns:pic="http://schemas.openxmlformats.org/drawingml/2006/picture">
+                  <pic:nvPicPr>
+                    <pic:cNvPr id="0" name="Picture 9"/>
+                    <pic:cNvPicPr>
+                      <a:picLocks noChangeAspect="1" noChangeArrowheads="1"/>
+                    </pic:cNvPicPr>
+                  </pic:nvPicPr>
+                  <pic:blipFill>
+                    <a:blip r:embed="rId10">
+                      <a:extLst>
+                        <a:ext uri="{28A0092B-C50C-407E-A947-70E740481C1C}">
+                          <a14:useLocalDpi xmlns:a14="http://schemas.microsoft.com/office/drawing/2010/main" val="0"/>
+                        </a:ext>
+                      </a:extLst>
+                    </a:blip>
+                    <a:srcRect/>
+                    <a:stretch>
+                      <a:fillRect/>
+                    </a:stretch>
+                  </pic:blipFill>
+                  <pic:spPr bwMode="auto">
+                    <a:xfrm>
+                      <a:off x="0" y="0"/>
+                      <a:ext cx="5181600" cy="2562225"/>
+                    </a:xfrm>
+                    <a:prstGeom prst="rect">
+                      <a:avLst/>
+                    </a:prstGeom>
+                    <a:noFill/>
+                    <a:ln>
+                      <a:noFill/>
+                    </a:ln>
+                  </pic:spPr>
+                </pic:pic>
+              </a:graphicData>
+            </a:graphic>
+          </wp:inline>
+        </w:drawing>
+      </w:r>
+    </w:p>
+    <w:p>
+      <w:pPr>
+        <w:rPr>
+          <w:highlight w:val="yellow"/>
+          <w:lang w:val="es"/>
+        </w:rPr>
+      </w:pPr>
+    </w:p>
+    <w:p>
+      <w:pPr>
+        <w:rPr>
+          <w:highlight w:val="yellow"/>
+          <w:lang w:val="es"/>
+        </w:rPr>
+      </w:pPr>
+    </w:p>
+    <w:p>
+      <w:pPr>
+        <w:jc w:val="center"/>
+        <w:rPr>
+          <w:b/>
+          <w:bCs/>
+          <w:lang w:val="es"/>
+        </w:rPr>
+      </w:pPr>
+      <w:r>
+        <w:rPr>
+          <w:b/>
+          <w:bCs/>
+          <w:lang w:val="es"/>
+        </w:rPr>
+        <w:t>Áreas donde más se utiliza Haskell</w:t>
+      </w:r>
+    </w:p>
+    <w:p>
+      <w:pPr>
+        <w:rPr>
+          <w:highlight w:val="yellow"/>
+          <w:lang w:val="es"/>
+        </w:rPr>
+      </w:pPr>
+    </w:p>
     <w:p>
       <w:pPr>
         <w:rPr>
@@ -63,7 +1083,7 @@
                     </pic:cNvPicPr>
                   </pic:nvPicPr>
                   <pic:blipFill>
-                    <a:blip r:embed="rId4">
+                    <a:blip r:embed="rId11">
                       <a:extLst>
                         <a:ext uri="{28A0092B-C50C-407E-A947-70E740481C1C}">
                           <a14:useLocalDpi xmlns:a14="http://schemas.microsoft.com/office/drawing/2010/main" val="0"/>
@@ -175,6 +1195,7 @@
         <w:rPr>
           <w:noProof/>
         </w:rPr>
+        <w:lastRenderedPageBreak/>
         <w:drawing>
           <wp:inline distT="0" distB="0" distL="0" distR="0" wp14:anchorId="32B0CE00" wp14:editId="22F018CC">
             <wp:extent cx="2371725" cy="1799240"/>
@@ -193,7 +1214,7 @@
                     </pic:cNvPicPr>
                   </pic:nvPicPr>
                   <pic:blipFill>
-                    <a:blip r:embed="rId5">
+                    <a:blip r:embed="rId12">
                       <a:extLst>
                         <a:ext uri="{28A0092B-C50C-407E-A947-70E740481C1C}">
                           <a14:useLocalDpi xmlns:a14="http://schemas.microsoft.com/office/drawing/2010/main" val="0"/>
@@ -305,9 +1326,8 @@
         <w:rPr>
           <w:noProof/>
         </w:rPr>
-        <w:lastRenderedPageBreak/>
         <w:drawing>
-          <wp:inline distT="0" distB="0" distL="0" distR="0" wp14:anchorId="709D415F" wp14:editId="12B8036B">
+          <wp:inline distT="0" distB="0" distL="0" distR="0" wp14:anchorId="709D415F" wp14:editId="275CA162">
             <wp:extent cx="2419350" cy="1612900"/>
             <wp:effectExtent l="0" t="0" r="0" b="6350"/>
             <wp:docPr id="4" name="Imagen 4" descr="Meta: Mark Zuckerberg reveló el nuevo nombre de Facebook, su compañía - LA  NACION"/>
@@ -324,7 +1344,7 @@
                     </pic:cNvPicPr>
                   </pic:nvPicPr>
                   <pic:blipFill>
-                    <a:blip r:embed="rId6" cstate="print">
+                    <a:blip r:embed="rId13" cstate="print">
                       <a:extLst>
                         <a:ext uri="{28A0092B-C50C-407E-A947-70E740481C1C}">
                           <a14:useLocalDpi xmlns:a14="http://schemas.microsoft.com/office/drawing/2010/main" val="0"/>
@@ -1011,6 +2031,7 @@
   <w:style w:type="character" w:default="1" w:styleId="Fuentedeprrafopredeter">
     <w:name w:val="Default Paragraph Font"/>
     <w:uiPriority w:val="1"/>
+    <w:semiHidden/>
     <w:unhideWhenUsed/>
   </w:style>
   <w:style w:type="table" w:default="1" w:styleId="Tablanormal">

</xml_diff>